<commit_message>
chore: clean up repo - remove generator scripts, add screenshots, update prompts.txt
Removed from tracking:
- generate_approach_doc.py (doc generation script, not part of the tool)
- generate_setup_guide.py (doc generation script, not part of the tool)
- PROJECT_APPROACH_v2.docx (duplicate of the approach document)

Added to tracking:
- 1_cli_asr_scores.png through 15_pytest_all.png (real terminal screenshots for documentation)
- PROJECT_APPROACH.pdf (submission document)

Updated:
- prompts.txt with repository cleanup entry
- .gitignore to prevent junk files from being added again
</commit_message>
<xml_diff>
--- a/SETUP_GUIDE.docx
+++ b/SETUP_GUIDE.docx
@@ -26,17 +26,6 @@
           <w:sz w:val="26"/>
         </w:rPr>
         <w:t>Complete Setup &amp; Usage Guide for New Users</w:t>
-      </w:r>
-    </w:p>
-    <w:p>
-      <w:pPr>
-        <w:jc w:val="center"/>
-      </w:pPr>
-      <w:r>
-        <w:rPr>
-          <w:color w:val="1A56DB"/>
-        </w:rPr>
-        <w:t>🚀 Live Demo: https://dialogue-frame-finder.onrender.com</w:t>
       </w:r>
     </w:p>
     <w:p/>
@@ -965,7 +954,7 @@
           </w:tcPr>
           <w:p>
             <w:r>
-              <w:t>⚠ Needs server-side cookies.txt</w:t>
+              <w:t>❌ Blocks Data Centers</w:t>
             </w:r>
           </w:p>
         </w:tc>
@@ -997,7 +986,7 @@
           </w:tcPr>
           <w:p>
             <w:r>
-              <w:t>✅ Yes</w:t>
+              <w:t>❌ Blocks Data Centers</w:t>
             </w:r>
           </w:p>
         </w:tc>
@@ -1061,7 +1050,7 @@
           </w:tcPr>
           <w:p>
             <w:r>
-              <w:t>❌ No (local files only)</w:t>
+              <w:t>✅ Yes</w:t>
             </w:r>
           </w:p>
         </w:tc>
@@ -1294,7 +1283,7 @@
         <w:rPr>
           <w:color w:val="1A56DB"/>
         </w:rPr>
-        <w:t>Using the Live Deployed Version</w:t>
+        <w:t>Setup Methods: Native Python vs. Docker</w:t>
       </w:r>
     </w:p>
     <w:p>
@@ -1302,21 +1291,49 @@
         <w:spacing w:after="120"/>
       </w:pPr>
       <w:r>
-        <w:t>If you just want to use the tool without installing anything, visit the live site:</w:t>
+        <w:t>While this project can technically run in Docker, the Native Python setup (described in Step 1-6 above) is STRONGLY recommended over Docker for several reasons:</w:t>
       </w:r>
     </w:p>
     <w:p>
       <w:pPr>
-        <w:spacing w:after="80"/>
-        <w:ind w:left="432"/>
+        <w:pStyle w:val="ListBullet"/>
       </w:pPr>
       <w:r>
         <w:rPr>
-          <w:rFonts w:ascii="Courier New" w:hAnsi="Courier New"/>
-          <w:color w:val="1A1A1A"/>
-          <w:sz w:val="20"/>
+          <w:b/>
         </w:rPr>
-        <w:t>https://dialogue-frame-finder.onrender.com</w:t>
+        <w:t xml:space="preserve">YouTube and Instagram Restrictions: </w:t>
+      </w:r>
+      <w:r>
+        <w:t>If you run Docker in a cloud data center, YouTube and Instagram will instantly block the video downloads because they blacklist cloud IPs to prevent bots. Running natively on your home computer bypasses this because you are using a residential internet connection.</w:t>
+      </w:r>
+    </w:p>
+    <w:p>
+      <w:pPr>
+        <w:pStyle w:val="ListBullet"/>
+      </w:pPr>
+      <w:r>
+        <w:rPr>
+          <w:b/>
+        </w:rPr>
+        <w:t xml:space="preserve">Hardware Acceleration: </w:t>
+      </w:r>
+      <w:r>
+        <w:t>Running AI models (like Whisper and PaddleOCR) inside Docker on Windows or Mac is usually limited to CPU processing and can be extremely slow. A native setup can more easily leverage your hardware.</w:t>
+      </w:r>
+    </w:p>
+    <w:p>
+      <w:pPr>
+        <w:pStyle w:val="ListBullet"/>
+      </w:pPr>
+      <w:r>
+        <w:rPr>
+          <w:b/>
+        </w:rPr>
+        <w:t xml:space="preserve">Massive File Sizes: </w:t>
+      </w:r>
+      <w:r>
+        <w:t>The Docker image is multiple gigabytes because it has to bundle the entire Chromium browser and all AI models into the image, making it cumbersome to build and run locally.</w:t>
       </w:r>
     </w:p>
     <w:p>
@@ -1326,33 +1343,15 @@
       <w:r>
         <w:rPr>
           <w:b/>
-          <w:color w:val="924000"/>
+          <w:color w:val="066B23"/>
         </w:rPr>
-        <w:t xml:space="preserve">📝 Note: </w:t>
+        <w:t xml:space="preserve">✅ Tip: </w:t>
       </w:r>
       <w:r>
         <w:rPr>
-          <w:color w:val="783500"/>
+          <w:color w:val="066B23"/>
         </w:rPr>
-        <w:t>The live site runs on Render's free tier and may be 'asleep' if no one has used it recently. When you first click Analyze, the button will show 'Waking up server (~50s)…' — this is normal. Wait about 50 seconds and it will start.</w:t>
-      </w:r>
-    </w:p>
-    <w:p>
-      <w:pPr>
-        <w:ind w:left="432"/>
-      </w:pPr>
-      <w:r>
-        <w:rPr>
-          <w:b/>
-          <w:color w:val="992200"/>
-        </w:rPr>
-        <w:t xml:space="preserve">⚠ Warning: </w:t>
-      </w:r>
-      <w:r>
-        <w:rPr>
-          <w:color w:val="992200"/>
-        </w:rPr>
-        <w:t>The live site cannot download YouTube videos due to YouTube's cloud-server IP ban. Use Instagram or OK.ru URLs on the live site. For YouTube videos, run the tool locally.</w:t>
+        <w:t>Always use the Native Python setup (Step 1-6) on your local computer for the most reliable, fastest, and error-free experience.</w:t>
       </w:r>
     </w:p>
     <w:p>

</xml_diff>

<commit_message>
docs: update prompts.txt, gitignore, screenshots and docs after cleanup
</commit_message>
<xml_diff>
--- a/SETUP_GUIDE.docx
+++ b/SETUP_GUIDE.docx
@@ -26,6 +26,17 @@
           <w:sz w:val="26"/>
         </w:rPr>
         <w:t>Complete Setup &amp; Usage Guide for New Users</w:t>
+      </w:r>
+    </w:p>
+    <w:p>
+      <w:pPr>
+        <w:jc w:val="center"/>
+      </w:pPr>
+      <w:r>
+        <w:rPr>
+          <w:color w:val="1A56DB"/>
+        </w:rPr>
+        <w:t>🚀 Live Demo: https://dialogue-frame-finder.onrender.com</w:t>
       </w:r>
     </w:p>
     <w:p/>
@@ -954,7 +965,7 @@
           </w:tcPr>
           <w:p>
             <w:r>
-              <w:t>❌ Blocks Data Centers</w:t>
+              <w:t>⚠ Needs server-side cookies.txt</w:t>
             </w:r>
           </w:p>
         </w:tc>
@@ -986,7 +997,7 @@
           </w:tcPr>
           <w:p>
             <w:r>
-              <w:t>❌ Blocks Data Centers</w:t>
+              <w:t>✅ Yes</w:t>
             </w:r>
           </w:p>
         </w:tc>
@@ -1050,7 +1061,7 @@
           </w:tcPr>
           <w:p>
             <w:r>
-              <w:t>✅ Yes</w:t>
+              <w:t>❌ No (local files only)</w:t>
             </w:r>
           </w:p>
         </w:tc>
@@ -1283,7 +1294,7 @@
         <w:rPr>
           <w:color w:val="1A56DB"/>
         </w:rPr>
-        <w:t>Setup Methods: Native Python vs. Docker</w:t>
+        <w:t>Using the Live Deployed Version</w:t>
       </w:r>
     </w:p>
     <w:p>
@@ -1291,49 +1302,21 @@
         <w:spacing w:after="120"/>
       </w:pPr>
       <w:r>
-        <w:t>While this project can technically run in Docker, the Native Python setup (described in Step 1-6 above) is STRONGLY recommended over Docker for several reasons:</w:t>
+        <w:t>If you just want to use the tool without installing anything, visit the live site:</w:t>
       </w:r>
     </w:p>
     <w:p>
       <w:pPr>
-        <w:pStyle w:val="ListBullet"/>
+        <w:spacing w:after="80"/>
+        <w:ind w:left="432"/>
       </w:pPr>
       <w:r>
         <w:rPr>
-          <w:b/>
+          <w:rFonts w:ascii="Courier New" w:hAnsi="Courier New"/>
+          <w:color w:val="1A1A1A"/>
+          <w:sz w:val="20"/>
         </w:rPr>
-        <w:t xml:space="preserve">YouTube and Instagram Restrictions: </w:t>
-      </w:r>
-      <w:r>
-        <w:t>If you run Docker in a cloud data center, YouTube and Instagram will instantly block the video downloads because they blacklist cloud IPs to prevent bots. Running natively on your home computer bypasses this because you are using a residential internet connection.</w:t>
-      </w:r>
-    </w:p>
-    <w:p>
-      <w:pPr>
-        <w:pStyle w:val="ListBullet"/>
-      </w:pPr>
-      <w:r>
-        <w:rPr>
-          <w:b/>
-        </w:rPr>
-        <w:t xml:space="preserve">Hardware Acceleration: </w:t>
-      </w:r>
-      <w:r>
-        <w:t>Running AI models (like Whisper and PaddleOCR) inside Docker on Windows or Mac is usually limited to CPU processing and can be extremely slow. A native setup can more easily leverage your hardware.</w:t>
-      </w:r>
-    </w:p>
-    <w:p>
-      <w:pPr>
-        <w:pStyle w:val="ListBullet"/>
-      </w:pPr>
-      <w:r>
-        <w:rPr>
-          <w:b/>
-        </w:rPr>
-        <w:t xml:space="preserve">Massive File Sizes: </w:t>
-      </w:r>
-      <w:r>
-        <w:t>The Docker image is multiple gigabytes because it has to bundle the entire Chromium browser and all AI models into the image, making it cumbersome to build and run locally.</w:t>
+        <w:t>https://dialogue-frame-finder.onrender.com</w:t>
       </w:r>
     </w:p>
     <w:p>
@@ -1343,15 +1326,33 @@
       <w:r>
         <w:rPr>
           <w:b/>
-          <w:color w:val="066B23"/>
+          <w:color w:val="924000"/>
         </w:rPr>
-        <w:t xml:space="preserve">✅ Tip: </w:t>
+        <w:t xml:space="preserve">📝 Note: </w:t>
       </w:r>
       <w:r>
         <w:rPr>
-          <w:color w:val="066B23"/>
+          <w:color w:val="783500"/>
         </w:rPr>
-        <w:t>Always use the Native Python setup (Step 1-6) on your local computer for the most reliable, fastest, and error-free experience.</w:t>
+        <w:t>The live site runs on Render's free tier and may be 'asleep' if no one has used it recently. When you first click Analyze, the button will show 'Waking up server (~50s)…' — this is normal. Wait about 50 seconds and it will start.</w:t>
+      </w:r>
+    </w:p>
+    <w:p>
+      <w:pPr>
+        <w:ind w:left="432"/>
+      </w:pPr>
+      <w:r>
+        <w:rPr>
+          <w:b/>
+          <w:color w:val="992200"/>
+        </w:rPr>
+        <w:t xml:space="preserve">⚠ Warning: </w:t>
+      </w:r>
+      <w:r>
+        <w:rPr>
+          <w:color w:val="992200"/>
+        </w:rPr>
+        <w:t>The live site cannot download YouTube videos due to YouTube's cloud-server IP ban. Use Instagram or OK.ru URLs on the live site. For YouTube videos, run the tool locally.</w:t>
       </w:r>
     </w:p>
     <w:p>

</xml_diff>